<commit_message>
fix: repair attendance and NASP certificate layout
Certificate of Attendance now keeps the name between the certify line and
the attended sentence, on one page, with the phone and fax separated.
The NASP letterhead is left aligned so the address, URL, and phone stay
clear of the logo. A New York certificate with no license number leaves
that line blank.

Co-authored-by: Karim Smires <ks1686@users.noreply.github.com>
</commit_message>
<xml_diff>
--- a/templates/nasp.docx
+++ b/templates/nasp.docx
@@ -18,17 +18,17 @@
         <w:tblLook w:val="04A0" w:firstRow="1" w:lastRow="0" w:firstColumn="1" w:lastColumn="0" w:noHBand="0" w:noVBand="1"/>
       </w:tblPr>
       <w:tblGrid>
-        <w:gridCol w:w="3600"/>
-        <w:gridCol w:w="2160"/>
+        <w:gridCol w:w="4320"/>
+        <w:gridCol w:w="2304"/>
       </w:tblGrid>
       <w:tr>
         <w:tc>
           <w:tcPr>
-            <w:tcW w:w="3600" w:type="dxa"/>
+            <w:tcW w:w="4320" w:type="dxa"/>
           </w:tcPr>
           <w:p>
             <w:pPr>
-              <w:jc w:val="both"/>
+              <w:jc w:val="left"/>
               <w:rPr>
                 <w:sz w:val="18"/>
                 <w:szCs w:val="18"/>
@@ -39,12 +39,26 @@
                 <w:sz w:val="18"/>
                 <w:szCs w:val="18"/>
               </w:rPr>
-              <w:t xml:space="preserve">Graduate School of Applied and Professional Psychology </w:t>
+              <w:t xml:space="preserve">Graduate School of Applied and</w:t>
+            </w:r>
+            <w:r>
+              <w:rPr>
+                <w:sz w:val="18"/>
+                <w:szCs w:val="18"/>
+              </w:rPr>
+              <w:br/>
+            </w:r>
+            <w:r>
+              <w:rPr>
+                <w:sz w:val="18"/>
+                <w:szCs w:val="18"/>
+              </w:rPr>
+              <w:t>Professional Psychology</w:t>
             </w:r>
           </w:p>
           <w:p>
             <w:pPr>
-              <w:jc w:val="both"/>
+              <w:jc w:val="left"/>
               <w:rPr>
                 <w:sz w:val="18"/>
                 <w:szCs w:val="18"/>
@@ -55,12 +69,28 @@
                 <w:sz w:val="18"/>
                 <w:szCs w:val="18"/>
               </w:rPr>
-              <w:t xml:space="preserve">Rutgers, The State University of New Jersey 152 Frelinghuysen Rd </w:t>
+              <w:t xml:space="preserve">Rutgers, The State University of New Jersey</w:t>
             </w:r>
           </w:p>
           <w:p>
             <w:pPr>
-              <w:jc w:val="both"/>
+              <w:jc w:val="left"/>
+              <w:rPr>
+                <w:sz w:val="18"/>
+                <w:szCs w:val="18"/>
+              </w:rPr>
+            </w:pPr>
+            <w:r>
+              <w:rPr>
+                <w:sz w:val="18"/>
+                <w:szCs w:val="18"/>
+              </w:rPr>
+              <w:t xml:space="preserve">152 Frelinghuysen Rd</w:t>
+            </w:r>
+          </w:p>
+          <w:p>
+            <w:pPr>
+              <w:jc w:val="left"/>
               <w:rPr>
                 <w:sz w:val="18"/>
                 <w:szCs w:val="18"/>
@@ -76,7 +106,7 @@
           </w:p>
           <w:p>
             <w:pPr>
-              <w:jc w:val="both"/>
+              <w:jc w:val="left"/>
               <w:rPr>
                 <w:sz w:val="18"/>
                 <w:szCs w:val="18"/>
@@ -86,7 +116,7 @@
         </w:tc>
         <w:tc>
           <w:tcPr>
-            <w:tcW w:w="2160" w:type="dxa"/>
+            <w:tcW w:w="2304" w:type="dxa"/>
           </w:tcPr>
           <w:p>
             <w:pPr>
@@ -100,7 +130,7 @@
                 <w:sz w:val="16"/>
                 <w:szCs w:val="16"/>
               </w:rPr>
-              <w:t xml:space="preserve">        http://gsapp.rutgers.edu</w:t>
+              <w:t xml:space="preserve">http://gsapp.rutgers.edu</w:t>
             </w:r>
           </w:p>
           <w:p>
@@ -115,7 +145,7 @@
                 <w:sz w:val="16"/>
                 <w:szCs w:val="16"/>
               </w:rPr>
-              <w:t xml:space="preserve">        Phone: </w:t>
+              <w:t xml:space="preserve">Phone: </w:t>
             </w:r>
             <w:r>
               <w:rPr>
@@ -158,7 +188,7 @@
                 <w:sz w:val="16"/>
                 <w:szCs w:val="16"/>
               </w:rPr>
-              <w:t xml:space="preserve">        Fax: </w:t>
+              <w:t xml:space="preserve">Fax: </w:t>
             </w:r>
             <w:r>
               <w:rPr>
@@ -772,7 +802,7 @@
           <wp:anchor distT="0" distB="0" distL="114300" distR="114300" simplePos="0" relativeHeight="251666432" behindDoc="0" locked="0" layoutInCell="1" allowOverlap="1" wp14:anchorId="440385A6" wp14:editId="0C95ACE1">
             <wp:simplePos x="0" y="0"/>
             <wp:positionH relativeFrom="margin">
-              <wp:posOffset>3670300</wp:posOffset>
+              <wp:posOffset>4343400</wp:posOffset>
             </wp:positionH>
             <wp:positionV relativeFrom="paragraph">
               <wp:posOffset>114935</wp:posOffset>

</xml_diff>